<commit_message>
Fix OMML equations in AHP priority vector Word document
Co-authored-by: sazmanfava854-sudo <sazmanfava854-sudo@users.noreply.github.com>
</commit_message>
<xml_diff>
--- a/docs/3-4-2_AHP_Priority_Vector_Formulas.docx
+++ b/docs/3-4-2_AHP_Priority_Vector_Formulas.docx
@@ -28,7 +28,7 @@
           <w:b w:val="0"/>
           <w:sz w:val="24"/>
         </w:rPr>
-        <w:t>پس از تشکیل ماتریس تجمیع‌شده Ā، بردار اولویت معیارها با روش تکرار توان (Power Iteration) محاسبه می‌شود. فرمول‌های مراحل ۱ تا ۴ به‌شرح زیر است:</w:t>
+        <w:t>پس از تشکیل ماتریس تجمیع‌شده Ā، بردار اولویت معیارها با روش تکرار توان (Power Iteration) محاسبه می‌شود. فرمول‌های مراحل ۱ تا ۴:</w:t>
       </w:r>
     </w:p>
     <w:p/>
@@ -43,21 +43,7 @@
           <w:b/>
           <w:sz w:val="24"/>
         </w:rPr>
-        <w:t>۱. مقداردهی اولیه</w:t>
-      </w:r>
-    </w:p>
-    <w:p>
-      <w:pPr>
-        <w:bidi w:val="1"/>
-        <w:jc w:val="right"/>
-      </w:pPr>
-      <w:r>
-        <w:rPr>
-          <w:rFonts w:ascii="B Nazanin" w:hAnsi="B Nazanin"/>
-          <w:b w:val="0"/>
-          <w:sz w:val="24"/>
-        </w:rPr>
-        <w:t>در گام نخست (t = 0):</w:t>
+        <w:t>۱. مقداردهی اولیه (t = 0)</w:t>
       </w:r>
     </w:p>
     <w:p>
@@ -68,22 +54,18 @@
         <m:oMath>
           <m:sSup>
             <m:e>
-              <m:r>
-                <m:t>
-                  <m:sSub>
-                    <m:e>
-                      <m:r>
-                        <m:t>w</m:t>
-                      </m:r>
-                    </m:e>
-                    <m:sub>
-                      <m:r>
-                        <m:t>i</m:t>
-                      </m:r>
-                    </m:sub>
-                  </m:sSub>
-                </m:t>
-              </m:r>
+              <m:sSub>
+                <m:e>
+                  <m:r>
+                    <m:t>w</m:t>
+                  </m:r>
+                </m:e>
+                <m:sub>
+                  <m:r>
+                    <m:t>i</m:t>
+                  </m:r>
+                </m:sub>
+              </m:sSub>
             </m:e>
             <m:sup>
               <m:r>
@@ -91,7 +73,9 @@
               </m:r>
             </m:sup>
           </m:sSup>
-           = 
+          <m:r>
+            <m:t xml:space="preserve"> = </m:t>
+          </m:r>
           <m:f>
             <m:num>
               <m:r>
@@ -103,7 +87,6 @@
                 <m:t>n</m:t>
               </m:r>
             </m:den>
-            <m:fPr/>
           </m:f>
         </m:oMath>
       </m:oMathPara>
@@ -137,20 +120,6 @@
     </w:p>
     <w:p>
       <w:pPr>
-        <w:bidi w:val="1"/>
-        <w:jc w:val="right"/>
-      </w:pPr>
-      <w:r>
-        <w:rPr>
-          <w:rFonts w:ascii="B Nazanin" w:hAnsi="B Nazanin"/>
-          <w:b w:val="0"/>
-          <w:sz w:val="24"/>
-        </w:rPr>
-        <w:t>در هر تکرار t:</w:t>
-      </w:r>
-    </w:p>
-    <w:p>
-      <w:pPr>
         <w:jc w:val="center"/>
       </w:pPr>
       <m:oMathPara>
@@ -168,14 +137,16 @@
             </m:sub>
           </m:sSub>
           <m:r>
-            <m:t xml:space="preserve">′ = </m:t>
+            <m:t>′</m:t>
+          </m:r>
+          <m:r>
+            <m:t xml:space="preserve"> = </m:t>
           </m:r>
           <m:nary>
             <m:naryPr>
               <m:chr m:val="∑"/>
-              <m:limLoc m:val="subSup"/>
-              <m:subHide m:val="1"/>
-              <m:supHide m:val="1"/>
+              <m:limLoc m:val="undOvr"/>
+              <m:grow m:val="1"/>
             </m:naryPr>
             <m:sub>
               <m:r>
@@ -201,26 +172,22 @@
                 </m:sub>
               </m:sSub>
               <m:r>
-                <m:t xml:space="preserve"> · </m:t>
+                <m:t> · </m:t>
               </m:r>
               <m:sSup>
                 <m:e>
-                  <m:r>
-                    <m:t>
-                      <m:sSub>
-                        <m:e>
-                          <m:r>
-                            <m:t>w</m:t>
-                          </m:r>
-                        </m:e>
-                        <m:sub>
-                          <m:r>
-                            <m:t>j</m:t>
-                          </m:r>
-                        </m:sub>
-                      </m:sSub>
-                    </m:t>
-                  </m:r>
+                  <m:sSub>
+                    <m:e>
+                      <m:r>
+                        <m:t>w</m:t>
+                      </m:r>
+                    </m:e>
+                    <m:sub>
+                      <m:r>
+                        <m:t>j</m:t>
+                      </m:r>
+                    </m:sub>
+                  </m:sSub>
                 </m:e>
                 <m:sup>
                   <m:r>
@@ -268,22 +235,18 @@
         <m:oMath>
           <m:sSup>
             <m:e>
-              <m:r>
-                <m:t>
-                  <m:sSub>
-                    <m:e>
-                      <m:r>
-                        <m:t>w</m:t>
-                      </m:r>
-                    </m:e>
-                    <m:sub>
-                      <m:r>
-                        <m:t>i</m:t>
-                      </m:r>
-                    </m:sub>
-                  </m:sSub>
-                </m:t>
-              </m:r>
+              <m:sSub>
+                <m:e>
+                  <m:r>
+                    <m:t>w</m:t>
+                  </m:r>
+                </m:e>
+                <m:sub>
+                  <m:r>
+                    <m:t>i</m:t>
+                  </m:r>
+                </m:sub>
+              </m:sSub>
             </m:e>
             <m:sup>
               <m:r>
@@ -291,7 +254,9 @@
               </m:r>
             </m:sup>
           </m:sSup>
-           = 
+          <m:r>
+            <m:t xml:space="preserve"> = </m:t>
+          </m:r>
           <m:f>
             <m:num>
               <m:sSub>
@@ -307,20 +272,19 @@
                 </m:sub>
               </m:sSub>
               <m:r>
-                <m:t xml:space="preserve">′</m:t>
+                <m:t>′</m:t>
               </m:r>
             </m:num>
             <m:den>
               <m:nary>
                 <m:naryPr>
                   <m:chr m:val="∑"/>
-                  <m:limLoc m:val="subSup"/>
-                  <m:subHide m:val="1"/>
-                  <m:supHide m:val="1"/>
+                  <m:limLoc m:val="undOvr"/>
+                  <m:grow m:val="1"/>
                 </m:naryPr>
                 <m:sub>
                   <m:r>
-                    <m:t>j=1</m:t>
+                    <m:t>k=1</m:t>
                   </m:r>
                 </m:sub>
                 <m:sup>
@@ -342,12 +306,11 @@
                     </m:sub>
                   </m:sSub>
                   <m:r>
-                    <m:t xml:space="preserve">′</m:t>
+                    <m:t>′</m:t>
                   </m:r>
                 </m:e>
               </m:nary>
             </m:den>
-            <m:fPr/>
           </m:f>
         </m:oMath>
       </m:oMathPara>
@@ -376,21 +339,7 @@
           <w:b/>
           <w:sz w:val="24"/>
         </w:rPr>
-        <w:t>۴. سنجش همگرایی و شرط توقف</w:t>
-      </w:r>
-    </w:p>
-    <w:p>
-      <w:pPr>
-        <w:bidi w:val="1"/>
-        <w:jc w:val="right"/>
-      </w:pPr>
-      <w:r>
-        <w:rPr>
-          <w:rFonts w:ascii="B Nazanin" w:hAnsi="B Nazanin"/>
-          <w:b w:val="0"/>
-          <w:sz w:val="24"/>
-        </w:rPr>
-        <w:t>شرط توقف:</w:t>
+        <w:t>۴. شرط همگرایی</w:t>
       </w:r>
     </w:p>
     <w:p>
@@ -416,22 +365,18 @@
           </m:r>
           <m:sSup>
             <m:e>
-              <m:r>
-                <m:t>
-                  <m:sSub>
-                    <m:e>
-                      <m:r>
-                        <m:t>w</m:t>
-                      </m:r>
-                    </m:e>
-                    <m:sub>
-                      <m:r>
-                        <m:t>i</m:t>
-                      </m:r>
-                    </m:sub>
-                  </m:sSub>
-                </m:t>
-              </m:r>
+              <m:sSub>
+                <m:e>
+                  <m:r>
+                    <m:t>w</m:t>
+                  </m:r>
+                </m:e>
+                <m:sub>
+                  <m:r>
+                    <m:t>i</m:t>
+                  </m:r>
+                </m:sub>
+              </m:sSub>
             </m:e>
             <m:sup>
               <m:r>
@@ -440,26 +385,22 @@
             </m:sup>
           </m:sSup>
           <m:r>
-            <m:t xml:space="preserve"> - </m:t>
+            <m:t xml:space="preserve"> − </m:t>
           </m:r>
           <m:sSup>
             <m:e>
-              <m:r>
-                <m:t>
-                  <m:sSub>
-                    <m:e>
-                      <m:r>
-                        <m:t>w</m:t>
-                      </m:r>
-                    </m:e>
-                    <m:sub>
-                      <m:r>
-                        <m:t>i</m:t>
-                      </m:r>
-                    </m:sub>
-                  </m:sSub>
-                </m:t>
-              </m:r>
+              <m:sSub>
+                <m:e>
+                  <m:r>
+                    <m:t>w</m:t>
+                  </m:r>
+                </m:e>
+                <m:sub>
+                  <m:r>
+                    <m:t>i</m:t>
+                  </m:r>
+                </m:sub>
+              </m:sSub>
             </m:e>
             <m:sup>
               <m:r>
@@ -468,7 +409,13 @@
             </m:sup>
           </m:sSup>
           <m:r>
-            <m:t xml:space="preserve"> | &amp;lt; ε</m:t>
+            <m:t xml:space="preserve"> | </m:t>
+          </m:r>
+          <m:r>
+            <m:t> &lt; </m:t>
+          </m:r>
+          <m:r>
+            <m:t>ε</m:t>
           </m:r>
         </m:oMath>
       </m:oMathPara>
@@ -497,7 +444,7 @@
           <w:b w:val="0"/>
           <w:sz w:val="24"/>
         </w:rPr>
-        <w:t>که ε = 10⁻¹² (آستانه عددی همگرایی).</w:t>
+        <w:t>که در آن ε = 10⁻¹².</w:t>
       </w:r>
     </w:p>
     <w:p>
@@ -511,7 +458,7 @@
           <w:b/>
           <w:sz w:val="24"/>
         </w:rPr>
-        <w:t>بردار نهایی</w:t>
+        <w:t>قید نرمال‌سازی بردار نهایی</w:t>
       </w:r>
     </w:p>
     <w:p>
@@ -523,9 +470,8 @@
           <m:nary>
             <m:naryPr>
               <m:chr m:val="∑"/>
-              <m:limLoc m:val="subSup"/>
-              <m:subHide m:val="1"/>
-              <m:supHide m:val="1"/>
+              <m:limLoc m:val="undOvr"/>
+              <m:grow m:val="1"/>
             </m:naryPr>
             <m:sub>
               <m:r>
@@ -582,7 +528,7 @@
           <w:b w:val="0"/>
           <w:sz w:val="24"/>
         </w:rPr>
-        <w:t>بردار W = [w₁, w₂, …, wₙ]ᵀ تقریب بردار ویژه غالب ماتریس Ā است. معیارها: برد انتقال، پشتیبانی سلولی، نرخ داده، بودجه پیوند، تأخیر RTT، مصرف انرژی، هزینه اتصال سالانه، هزینه سخت‌افزار (n = 8).</w:t>
+        <w:t>بردار W = [w₁, w₂, …, wₙ]ᵀ تقریب بردار ویژه غالب ماتریس Ā است (n = 8).</w:t>
       </w:r>
     </w:p>
     <w:sectPr>

</xml_diff>